<commit_message>
Add currency support for advance and milestone advance
</commit_message>
<xml_diff>
--- a/static/contract_templates/50_50 template med placeholders.docx
+++ b/static/contract_templates/50_50 template med placeholders.docx
@@ -1592,30 +1592,30 @@
           <w:sz w:val="20"/>
         </w:rPr>
         <w:tab/>
-        <w:t>Company shall pay Artist a non-returnable, but fully recoupable, advance of USD {{advance_amount_numeric}} ({{advance_amount_words}} American Dollars) upon signature and Company's receipt of valid invoice and all assets including all audio files, artwork and existing UPC/ISRC codes (if any).{% endif %}</w:t>
-      </w:r>
-    </w:p>
-    <w:p>
-      <w:pPr>
-        <w:widowControl w:val="0"/>
-        <w:autoSpaceDE w:val="0"/>
-        <w:autoSpaceDN w:val="0"/>
-        <w:adjustRightInd w:val="0"/>
-        <w:jc w:val="both"/>
-        <w:rPr>
-          <w:rFonts w:cs="Helvetica"/>
-          <w:sz w:val="20"/>
-          <w:szCs w:val="20"/>
-          <w:lang w:val="en-US"/>
-        </w:rPr>
-      </w:pPr>
-    </w:p>
-    <w:p>
-      <w:r>
-        <w:rPr>
-          <w:sz w:val="20"/>
-        </w:rPr>
-        <w:t>{% if milestone_enabled %}In the event that the recording reaches {{milestone_daily_streams}} daily streams for an uninterrupted period of {{milestone_period_days}} days, Artist shall be entitled to a non-returnable, but fully recoupable, {% if advance_enabled %}additional {% endif %}advance of USD {{milestone_advance_amount_numeric}} ({{milestone_advance_amount_words}} American Dollars) upon Company's receipt of valid invoice.{% endif %}</w:t>
+        <w:t>Company shall pay Artist a non-returnable, but fully recoupable, advance of {{advance_currency}} {{advance_amount_formatted}} ({{advance_amount_words}} {{advance_currency_name}}) upon signature and Company's receipt of valid invoice and all assets including all audio files, artwork and existing UPC/ISRC codes (if any).{% endif %}</w:t>
+      </w:r>
+    </w:p>
+    <w:p>
+      <w:pPr>
+        <w:widowControl w:val="0"/>
+        <w:autoSpaceDE w:val="0"/>
+        <w:autoSpaceDN w:val="0"/>
+        <w:adjustRightInd w:val="0"/>
+        <w:jc w:val="both"/>
+        <w:rPr>
+          <w:rFonts w:cs="Helvetica"/>
+          <w:sz w:val="20"/>
+          <w:szCs w:val="20"/>
+          <w:lang w:val="en-US"/>
+        </w:rPr>
+      </w:pPr>
+    </w:p>
+    <w:p>
+      <w:r>
+        <w:rPr>
+          <w:sz w:val="20"/>
+        </w:rPr>
+        <w:t>{% if milestone_enabled %}In the event that the recording reaches {{milestone_daily_streams}} daily streams for an uninterrupted period of {{milestone_period_days}} days, Artist shall be entitled to a non-returnable, but fully recoupable, {% if advance_enabled %}additional {% endif %}advance of {{milestone_currency}} {{milestone_advance_amount_formatted}} ({{milestone_advance_amount_words}} {{advance_currency_name}}) upon Company's receipt of valid invoice.{% endif %}</w:t>
       </w:r>
     </w:p>
     <w:p/>

</xml_diff>